<commit_message>
Organizer Playbook: add Section 7 - Driving attendance (pre-event cadence, scarcity/friction tactics, reminder cadence table, day-of reminder email template)
Co-authored-by: Cursor <cursoragent@cursor.com>
</commit_message>
<xml_diff>
--- a/AI-Assurance_Organizer-Playbook.docx
+++ b/AI-Assurance_Organizer-Playbook.docx
@@ -3399,6 +3399,1240 @@
         <w:t>ThousandEyes trials started, Meraki API keys activated, opportunities advanced within 30 days.</w:t>
       </w:r>
     </w:p>
+    <w:p>
+      <w:pPr>
+        <w:pBdr>
+          <w:bottom w:val="single" w:sz="6" w:space="2" w:color="CC785C"/>
+        </w:pBdr>
+        <w:spacing w:before="280" w:after="120"/>
+      </w:pPr>
+      <w:r>
+        <w:rPr>
+          <w:b/>
+          <w:bCs/>
+          <w:color w:val="0A1F3C"/>
+          <w:spacing w:val="6"/>
+          <w:sz w:val="21"/>
+          <w:szCs w:val="21"/>
+        </w:rPr>
+        <w:t>7 · Driving attendance</w:t>
+      </w:r>
+    </w:p>
+    <w:p>
+      <w:pPr>
+        <w:spacing w:after="100"/>
+      </w:pPr>
+      <w:r>
+        <w:t>Most of the lift happens before the day, not from the reminder email alone. Layer these into the Run-of-show checklist in Section 5 — the suggested cadence and day-of email template are below.</w:t>
+      </w:r>
+    </w:p>
+    <w:p>
+      <w:pPr>
+        <w:spacing w:after="60"/>
+      </w:pPr>
+      <w:r>
+        <w:rPr>
+          <w:b/>
+          <w:bCs/>
+          <w:color w:val="0792B5"/>
+        </w:rPr>
+        <w:t>Before the event</w:t>
+      </w:r>
+    </w:p>
+    <w:p>
+      <w:pPr>
+        <w:pStyle w:val="ListParagraph"/>
+        <w:numPr>
+          <w:ilvl w:val="0"/>
+          <w:numId w:val="2"/>
+        </w:numPr>
+        <w:spacing w:after="60"/>
+      </w:pPr>
+      <w:r>
+        <w:rPr>
+          <w:b/>
+          <w:bCs/>
+          <w:color w:val="0792B5"/>
+        </w:rPr>
+        <w:t xml:space="preserve">Multi-touch sequence: </w:t>
+      </w:r>
+      <w:r>
+        <w:t>confirmation right after registering, then reminders at 1 week, 2–3 days, and day-of. Each should add something new (agenda, speaker, attendee list), not just repeat.</w:t>
+      </w:r>
+    </w:p>
+    <w:p>
+      <w:pPr>
+        <w:pStyle w:val="ListParagraph"/>
+        <w:numPr>
+          <w:ilvl w:val="0"/>
+          <w:numId w:val="2"/>
+        </w:numPr>
+        <w:spacing w:after="60"/>
+      </w:pPr>
+      <w:r>
+        <w:rPr>
+          <w:b/>
+          <w:bCs/>
+          <w:color w:val="0792B5"/>
+        </w:rPr>
+        <w:t xml:space="preserve">Pre-work that creates ownership: </w:t>
+      </w:r>
+      <w:r>
+        <w:t>ask registrants to submit the problem they want to tackle in the workshop. People who invest effort show up.</w:t>
+      </w:r>
+    </w:p>
+    <w:p>
+      <w:pPr>
+        <w:pStyle w:val="ListParagraph"/>
+        <w:numPr>
+          <w:ilvl w:val="0"/>
+          <w:numId w:val="2"/>
+        </w:numPr>
+        <w:spacing w:after="60"/>
+      </w:pPr>
+      <w:r>
+        <w:rPr>
+          <w:b/>
+          <w:bCs/>
+          <w:color w:val="0792B5"/>
+        </w:rPr>
+        <w:t xml:space="preserve">Personal outreach to key accounts: </w:t>
+      </w:r>
+      <w:r>
+        <w:t>a short text or LinkedIn message from the host to the top 10–15 registrants beats any mass email.</w:t>
+      </w:r>
+    </w:p>
+    <w:p>
+      <w:pPr>
+        <w:pStyle w:val="ListParagraph"/>
+        <w:numPr>
+          <w:ilvl w:val="0"/>
+          <w:numId w:val="2"/>
+        </w:numPr>
+        <w:spacing w:after="60"/>
+      </w:pPr>
+      <w:r>
+        <w:rPr>
+          <w:b/>
+          <w:bCs/>
+          <w:color w:val="0792B5"/>
+        </w:rPr>
+        <w:t xml:space="preserve">Bring a colleague: </w:t>
+      </w:r>
+      <w:r>
+        <w:t>suggest they invite a teammate. People rarely flake on a commitment made with someone else.</w:t>
+      </w:r>
+    </w:p>
+    <w:p>
+      <w:pPr>
+        <w:pStyle w:val="ListParagraph"/>
+        <w:numPr>
+          <w:ilvl w:val="0"/>
+          <w:numId w:val="2"/>
+        </w:numPr>
+        <w:spacing w:after="60"/>
+      </w:pPr>
+      <w:r>
+        <w:rPr>
+          <w:b/>
+          <w:bCs/>
+          <w:color w:val="0792B5"/>
+        </w:rPr>
+        <w:t xml:space="preserve">Calendar hold: </w:t>
+      </w:r>
+      <w:r>
+        <w:t>include an .ics file in the confirmation so it's on their calendar with the address.</w:t>
+      </w:r>
+    </w:p>
+    <w:p>
+      <w:pPr>
+        <w:spacing w:after="60"/>
+      </w:pPr>
+      <w:r>
+        <w:rPr>
+          <w:b/>
+          <w:bCs/>
+          <w:color w:val="0792B5"/>
+        </w:rPr>
+        <w:t>Make it hard to skip</w:t>
+      </w:r>
+    </w:p>
+    <w:p>
+      <w:pPr>
+        <w:pStyle w:val="ListParagraph"/>
+        <w:numPr>
+          <w:ilvl w:val="0"/>
+          <w:numId w:val="2"/>
+        </w:numPr>
+        <w:spacing w:after="60"/>
+      </w:pPr>
+      <w:r>
+        <w:rPr>
+          <w:b/>
+          <w:bCs/>
+          <w:color w:val="0792B5"/>
+        </w:rPr>
+        <w:t xml:space="preserve">Exclusive, non-recorded content: </w:t>
+      </w:r>
+      <w:r>
+        <w:t>if the workshop materials only go to attendees, say so plainly.</w:t>
+      </w:r>
+    </w:p>
+    <w:p>
+      <w:pPr>
+        <w:pStyle w:val="ListParagraph"/>
+        <w:numPr>
+          <w:ilvl w:val="0"/>
+          <w:numId w:val="2"/>
+        </w:numPr>
+        <w:spacing w:after="60"/>
+      </w:pPr>
+      <w:r>
+        <w:rPr>
+          <w:b/>
+          <w:bCs/>
+          <w:color w:val="0792B5"/>
+        </w:rPr>
+        <w:t xml:space="preserve">Honest scarcity: </w:t>
+      </w:r>
+      <w:r>
+        <w:t>“We capped it at 40 so everyone gets hands-on time.”</w:t>
+      </w:r>
+    </w:p>
+    <w:p>
+      <w:pPr>
+        <w:pStyle w:val="ListParagraph"/>
+        <w:numPr>
+          <w:ilvl w:val="0"/>
+          <w:numId w:val="2"/>
+        </w:numPr>
+        <w:spacing w:after="60"/>
+      </w:pPr>
+      <w:r>
+        <w:rPr>
+          <w:b/>
+          <w:bCs/>
+          <w:color w:val="0792B5"/>
+        </w:rPr>
+        <w:t xml:space="preserve">Attendee preview: </w:t>
+      </w:r>
+      <w:r>
+        <w:t>share which companies or roles are coming (with permission). Peer conversations are the biggest draw — make them visible.</w:t>
+      </w:r>
+    </w:p>
+    <w:p>
+      <w:pPr>
+        <w:spacing w:after="60"/>
+      </w:pPr>
+      <w:r>
+        <w:rPr>
+          <w:b/>
+          <w:bCs/>
+          <w:color w:val="0792B5"/>
+        </w:rPr>
+        <w:t>Reduce friction</w:t>
+      </w:r>
+    </w:p>
+    <w:p>
+      <w:pPr>
+        <w:pStyle w:val="ListParagraph"/>
+        <w:numPr>
+          <w:ilvl w:val="0"/>
+          <w:numId w:val="2"/>
+        </w:numPr>
+        <w:spacing w:after="60"/>
+      </w:pPr>
+      <w:r>
+        <w:rPr>
+          <w:b/>
+          <w:bCs/>
+          <w:color w:val="0792B5"/>
+        </w:rPr>
+        <w:t xml:space="preserve">Logistics up front: </w:t>
+      </w:r>
+      <w:r>
+        <w:t>parking, check-in, what to bring, and a clear start time — reuse the Section 4 prerequisites email.</w:t>
+      </w:r>
+    </w:p>
+    <w:p>
+      <w:pPr>
+        <w:pStyle w:val="ListParagraph"/>
+        <w:numPr>
+          <w:ilvl w:val="0"/>
+          <w:numId w:val="2"/>
+        </w:numPr>
+        <w:spacing w:after="60"/>
+      </w:pPr>
+      <w:r>
+        <w:rPr>
+          <w:b/>
+          <w:bCs/>
+          <w:color w:val="0792B5"/>
+        </w:rPr>
+        <w:t xml:space="preserve">Easy opt-out: </w:t>
+      </w:r>
+      <w:r>
+        <w:t>offer a “can't make it” link so you can backfill from a waitlist and learn who's out early.</w:t>
+      </w:r>
+    </w:p>
+    <w:p>
+      <w:pPr>
+        <w:pStyle w:val="ListParagraph"/>
+        <w:numPr>
+          <w:ilvl w:val="0"/>
+          <w:numId w:val="2"/>
+        </w:numPr>
+        <w:spacing w:after="60"/>
+      </w:pPr>
+      <w:r>
+        <w:rPr>
+          <w:b/>
+          <w:bCs/>
+          <w:color w:val="0792B5"/>
+        </w:rPr>
+        <w:t xml:space="preserve">Plan for no-shows: </w:t>
+      </w:r>
+      <w:r>
+        <w:t>overbook by roughly 20–30%, since in-person events typically see meaningful drop-off.</w:t>
+      </w:r>
+    </w:p>
+    <w:p>
+      <w:pPr>
+        <w:spacing w:after="60"/>
+      </w:pPr>
+      <w:r>
+        <w:rPr>
+          <w:b/>
+          <w:bCs/>
+          <w:color w:val="0792B5"/>
+        </w:rPr>
+        <w:t>Day-of and after</w:t>
+      </w:r>
+    </w:p>
+    <w:p>
+      <w:pPr>
+        <w:pStyle w:val="ListParagraph"/>
+        <w:numPr>
+          <w:ilvl w:val="0"/>
+          <w:numId w:val="2"/>
+        </w:numPr>
+        <w:spacing w:after="60"/>
+      </w:pPr>
+      <w:r>
+        <w:rPr>
+          <w:b/>
+          <w:bCs/>
+          <w:color w:val="0792B5"/>
+        </w:rPr>
+        <w:t xml:space="preserve">Morning text to high-priority registrants: </w:t>
+      </w:r>
+      <w:r>
+        <w:t>“Saved you a seat, see you at [time]?” from the host.</w:t>
+      </w:r>
+    </w:p>
+    <w:p>
+      <w:pPr>
+        <w:pStyle w:val="ListParagraph"/>
+        <w:numPr>
+          <w:ilvl w:val="0"/>
+          <w:numId w:val="2"/>
+        </w:numPr>
+        <w:spacing w:after="60"/>
+      </w:pPr>
+      <w:r>
+        <w:rPr>
+          <w:b/>
+          <w:bCs/>
+          <w:color w:val="0792B5"/>
+        </w:rPr>
+        <w:t xml:space="preserve">Timing: </w:t>
+      </w:r>
+      <w:r>
+        <w:t>send the day-of email (template below) early enough that people can rearrange their day, but not so early it's buried.</w:t>
+      </w:r>
+    </w:p>
+    <w:p>
+      <w:pPr>
+        <w:pStyle w:val="ListParagraph"/>
+        <w:numPr>
+          <w:ilvl w:val="0"/>
+          <w:numId w:val="2"/>
+        </w:numPr>
+        <w:spacing w:after="60"/>
+      </w:pPr>
+      <w:r>
+        <w:rPr>
+          <w:b/>
+          <w:bCs/>
+          <w:color w:val="0792B5"/>
+        </w:rPr>
+        <w:t xml:space="preserve">Afterward: </w:t>
+      </w:r>
+      <w:r>
+        <w:t>send no-shows a “sorry we missed you” note with a teaser of what they missed and an invite to the next one — it builds FOMO that improves attendance next time.</w:t>
+      </w:r>
+    </w:p>
+    <w:p>
+      <w:pPr>
+        <w:spacing w:after="60"/>
+      </w:pPr>
+      <w:r>
+        <w:rPr>
+          <w:b/>
+          <w:bCs/>
+          <w:color w:val="0792B5"/>
+        </w:rPr>
+        <w:t>Suggested reminder cadence</w:t>
+      </w:r>
+    </w:p>
+    <w:tbl>
+      <w:tblPr>
+        <w:tblW w:w="9360" w:type="dxa"/>
+        <w:tblInd w:w="-5" w:type="dxa"/>
+        <w:tblBorders>
+          <w:top w:val="single" w:sz="4" w:space="0" w:color="auto"/>
+          <w:left w:val="single" w:sz="4" w:space="0" w:color="auto"/>
+          <w:bottom w:val="single" w:sz="4" w:space="0" w:color="auto"/>
+          <w:right w:val="single" w:sz="4" w:space="0" w:color="auto"/>
+          <w:insideH w:val="single" w:sz="4" w:space="0" w:color="auto"/>
+          <w:insideV w:val="single" w:sz="4" w:space="0" w:color="auto"/>
+        </w:tblBorders>
+        <w:tblCellMar>
+          <w:left w:w="10" w:type="dxa"/>
+          <w:right w:w="10" w:type="dxa"/>
+        </w:tblCellMar>
+        <w:tblLook w:val="04A0" w:firstRow="1" w:lastRow="0" w:firstColumn="1" w:lastColumn="0" w:noHBand="0" w:noVBand="1"/>
+      </w:tblPr>
+      <w:tblGrid>
+        <w:gridCol w:w="3600"/>
+        <w:gridCol w:w="1200"/>
+        <w:gridCol w:w="4560"/>
+      </w:tblGrid>
+      <w:tr>
+        <w:trPr>
+          <w:tblHeader/>
+        </w:trPr>
+        <w:tc>
+          <w:tcPr>
+            <w:tcW w:w="3600" w:type="dxa"/>
+            <w:tcBorders>
+              <w:top w:val="single" w:sz="2" w:space="0" w:color="E6E1D8"/>
+              <w:left w:val="single" w:sz="2" w:space="0" w:color="E6E1D8"/>
+              <w:bottom w:val="single" w:sz="2" w:space="0" w:color="E6E1D8"/>
+              <w:right w:val="single" w:sz="2" w:space="0" w:color="E6E1D8"/>
+            </w:tcBorders>
+            <w:shd w:val="clear" w:color="auto" w:fill="0D274D"/>
+            <w:tcMar>
+              <w:top w:w="80" w:type="dxa"/>
+              <w:left w:w="120" w:type="dxa"/>
+              <w:bottom w:w="80" w:type="dxa"/>
+              <w:right w:w="120" w:type="dxa"/>
+            </w:tcMar>
+            <w:vAlign w:val="center"/>
+          </w:tcPr>
+          <w:p>
+            <w:r>
+              <w:t>Touchpoint</w:t>
+            </w:r>
+          </w:p>
+        </w:tc>
+        <w:tc>
+          <w:tcPr>
+            <w:tcW w:w="1200" w:type="dxa"/>
+            <w:tcBorders>
+              <w:top w:val="single" w:sz="2" w:space="0" w:color="E6E1D8"/>
+              <w:left w:val="single" w:sz="2" w:space="0" w:color="E6E1D8"/>
+              <w:bottom w:val="single" w:sz="2" w:space="0" w:color="E6E1D8"/>
+              <w:right w:val="single" w:sz="2" w:space="0" w:color="E6E1D8"/>
+            </w:tcBorders>
+            <w:shd w:val="clear" w:color="auto" w:fill="0D274D"/>
+            <w:tcMar>
+              <w:top w:w="80" w:type="dxa"/>
+              <w:left w:w="120" w:type="dxa"/>
+              <w:bottom w:w="80" w:type="dxa"/>
+              <w:right w:w="120" w:type="dxa"/>
+            </w:tcMar>
+            <w:vAlign w:val="center"/>
+          </w:tcPr>
+          <w:p>
+            <w:r>
+              <w:t>Timing</w:t>
+            </w:r>
+          </w:p>
+        </w:tc>
+        <w:tc>
+          <w:tcPr>
+            <w:tcW w:w="4560" w:type="dxa"/>
+            <w:tcBorders>
+              <w:top w:val="single" w:sz="2" w:space="0" w:color="E6E1D8"/>
+              <w:left w:val="single" w:sz="2" w:space="0" w:color="E6E1D8"/>
+              <w:bottom w:val="single" w:sz="2" w:space="0" w:color="E6E1D8"/>
+              <w:right w:val="single" w:sz="2" w:space="0" w:color="E6E1D8"/>
+            </w:tcBorders>
+            <w:shd w:val="clear" w:color="auto" w:fill="0D274D"/>
+            <w:tcMar>
+              <w:top w:w="80" w:type="dxa"/>
+              <w:left w:w="120" w:type="dxa"/>
+              <w:bottom w:w="80" w:type="dxa"/>
+              <w:right w:w="120" w:type="dxa"/>
+            </w:tcMar>
+            <w:vAlign w:val="center"/>
+          </w:tcPr>
+          <w:p>
+            <w:r>
+              <w:t>What's new in it</w:t>
+            </w:r>
+          </w:p>
+        </w:tc>
+      </w:tr>
+      <w:tr>
+        <w:tc>
+          <w:tcPr>
+            <w:tcW w:w="3600" w:type="dxa"/>
+            <w:tcBorders>
+              <w:top w:val="single" w:sz="2" w:space="0" w:color="E6E1D8"/>
+              <w:left w:val="single" w:sz="2" w:space="0" w:color="E6E1D8"/>
+              <w:bottom w:val="single" w:sz="2" w:space="0" w:color="E6E1D8"/>
+              <w:right w:val="single" w:sz="2" w:space="0" w:color="E6E1D8"/>
+            </w:tcBorders>
+            <w:tcMar>
+              <w:top w:w="70" w:type="dxa"/>
+              <w:left w:w="120" w:type="dxa"/>
+              <w:bottom w:w="70" w:type="dxa"/>
+              <w:right w:w="120" w:type="dxa"/>
+            </w:tcMar>
+            <w:vAlign w:val="center"/>
+          </w:tcPr>
+          <w:p>
+            <w:r>
+              <w:t>Confirmation</w:t>
+            </w:r>
+          </w:p>
+        </w:tc>
+        <w:tc>
+          <w:tcPr>
+            <w:tcW w:w="1200" w:type="dxa"/>
+            <w:tcBorders>
+              <w:top w:val="single" w:sz="2" w:space="0" w:color="E6E1D8"/>
+              <w:left w:val="single" w:sz="2" w:space="0" w:color="E6E1D8"/>
+              <w:bottom w:val="single" w:sz="2" w:space="0" w:color="E6E1D8"/>
+              <w:right w:val="single" w:sz="2" w:space="0" w:color="E6E1D8"/>
+            </w:tcBorders>
+            <w:tcMar>
+              <w:top w:w="70" w:type="dxa"/>
+              <w:left w:w="120" w:type="dxa"/>
+              <w:bottom w:w="70" w:type="dxa"/>
+              <w:right w:w="120" w:type="dxa"/>
+            </w:tcMar>
+            <w:vAlign w:val="center"/>
+          </w:tcPr>
+          <w:p>
+            <w:r>
+              <w:t>At registration</w:t>
+            </w:r>
+          </w:p>
+        </w:tc>
+        <w:tc>
+          <w:tcPr>
+            <w:tcW w:w="4560" w:type="dxa"/>
+            <w:tcBorders>
+              <w:top w:val="single" w:sz="2" w:space="0" w:color="E6E1D8"/>
+              <w:left w:val="single" w:sz="2" w:space="0" w:color="E6E1D8"/>
+              <w:bottom w:val="single" w:sz="2" w:space="0" w:color="E6E1D8"/>
+              <w:right w:val="single" w:sz="2" w:space="0" w:color="E6E1D8"/>
+            </w:tcBorders>
+            <w:tcMar>
+              <w:top w:w="70" w:type="dxa"/>
+              <w:left w:w="120" w:type="dxa"/>
+              <w:bottom w:w="70" w:type="dxa"/>
+              <w:right w:w="120" w:type="dxa"/>
+            </w:tcMar>
+            <w:vAlign w:val="center"/>
+          </w:tcPr>
+          <w:p>
+            <w:r>
+              <w:t>Calendar invite, logistics, what to bring</w:t>
+            </w:r>
+          </w:p>
+        </w:tc>
+      </w:tr>
+      <w:tr>
+        <w:tc>
+          <w:tcPr>
+            <w:tcW w:w="3600" w:type="dxa"/>
+            <w:tcBorders>
+              <w:top w:val="single" w:sz="2" w:space="0" w:color="E6E1D8"/>
+              <w:left w:val="single" w:sz="2" w:space="0" w:color="E6E1D8"/>
+              <w:bottom w:val="single" w:sz="2" w:space="0" w:color="E6E1D8"/>
+              <w:right w:val="single" w:sz="2" w:space="0" w:color="E6E1D8"/>
+            </w:tcBorders>
+            <w:tcMar>
+              <w:top w:w="70" w:type="dxa"/>
+              <w:left w:w="120" w:type="dxa"/>
+              <w:bottom w:w="70" w:type="dxa"/>
+              <w:right w:w="120" w:type="dxa"/>
+            </w:tcMar>
+            <w:vAlign w:val="center"/>
+          </w:tcPr>
+          <w:p>
+            <w:r>
+              <w:t>Reminder 1</w:t>
+            </w:r>
+          </w:p>
+        </w:tc>
+        <w:tc>
+          <w:tcPr>
+            <w:tcW w:w="1200" w:type="dxa"/>
+            <w:tcBorders>
+              <w:top w:val="single" w:sz="2" w:space="0" w:color="E6E1D8"/>
+              <w:left w:val="single" w:sz="2" w:space="0" w:color="E6E1D8"/>
+              <w:bottom w:val="single" w:sz="2" w:space="0" w:color="E6E1D8"/>
+              <w:right w:val="single" w:sz="2" w:space="0" w:color="E6E1D8"/>
+            </w:tcBorders>
+            <w:tcMar>
+              <w:top w:w="70" w:type="dxa"/>
+              <w:left w:w="120" w:type="dxa"/>
+              <w:bottom w:w="70" w:type="dxa"/>
+              <w:right w:w="120" w:type="dxa"/>
+            </w:tcMar>
+            <w:vAlign w:val="center"/>
+          </w:tcPr>
+          <w:p>
+            <w:r>
+              <w:t>1 week out</w:t>
+            </w:r>
+          </w:p>
+        </w:tc>
+        <w:tc>
+          <w:tcPr>
+            <w:tcW w:w="4560" w:type="dxa"/>
+            <w:tcBorders>
+              <w:top w:val="single" w:sz="2" w:space="0" w:color="E6E1D8"/>
+              <w:left w:val="single" w:sz="2" w:space="0" w:color="E6E1D8"/>
+              <w:bottom w:val="single" w:sz="2" w:space="0" w:color="E6E1D8"/>
+              <w:right w:val="single" w:sz="2" w:space="0" w:color="E6E1D8"/>
+            </w:tcBorders>
+            <w:tcMar>
+              <w:top w:w="70" w:type="dxa"/>
+              <w:left w:w="120" w:type="dxa"/>
+              <w:bottom w:w="70" w:type="dxa"/>
+              <w:right w:w="120" w:type="dxa"/>
+            </w:tcMar>
+            <w:vAlign w:val="center"/>
+          </w:tcPr>
+          <w:p>
+            <w:r>
+              <w:t>Agenda and workshop preview</w:t>
+            </w:r>
+          </w:p>
+        </w:tc>
+      </w:tr>
+      <w:tr>
+        <w:tc>
+          <w:tcPr>
+            <w:tcW w:w="3600" w:type="dxa"/>
+            <w:tcBorders>
+              <w:top w:val="single" w:sz="2" w:space="0" w:color="E6E1D8"/>
+              <w:left w:val="single" w:sz="2" w:space="0" w:color="E6E1D8"/>
+              <w:bottom w:val="single" w:sz="2" w:space="0" w:color="E6E1D8"/>
+              <w:right w:val="single" w:sz="2" w:space="0" w:color="E6E1D8"/>
+            </w:tcBorders>
+            <w:tcMar>
+              <w:top w:w="70" w:type="dxa"/>
+              <w:left w:w="120" w:type="dxa"/>
+              <w:bottom w:w="70" w:type="dxa"/>
+              <w:right w:w="120" w:type="dxa"/>
+            </w:tcMar>
+            <w:vAlign w:val="center"/>
+          </w:tcPr>
+          <w:p>
+            <w:r>
+              <w:t>Reminder 2</w:t>
+            </w:r>
+          </w:p>
+        </w:tc>
+        <w:tc>
+          <w:tcPr>
+            <w:tcW w:w="1200" w:type="dxa"/>
+            <w:tcBorders>
+              <w:top w:val="single" w:sz="2" w:space="0" w:color="E6E1D8"/>
+              <w:left w:val="single" w:sz="2" w:space="0" w:color="E6E1D8"/>
+              <w:bottom w:val="single" w:sz="2" w:space="0" w:color="E6E1D8"/>
+              <w:right w:val="single" w:sz="2" w:space="0" w:color="E6E1D8"/>
+            </w:tcBorders>
+            <w:tcMar>
+              <w:top w:w="70" w:type="dxa"/>
+              <w:left w:w="120" w:type="dxa"/>
+              <w:bottom w:w="70" w:type="dxa"/>
+              <w:right w:w="120" w:type="dxa"/>
+            </w:tcMar>
+            <w:vAlign w:val="center"/>
+          </w:tcPr>
+          <w:p>
+            <w:r>
+              <w:t>2–3 days out</w:t>
+            </w:r>
+          </w:p>
+        </w:tc>
+        <w:tc>
+          <w:tcPr>
+            <w:tcW w:w="4560" w:type="dxa"/>
+            <w:tcBorders>
+              <w:top w:val="single" w:sz="2" w:space="0" w:color="E6E1D8"/>
+              <w:left w:val="single" w:sz="2" w:space="0" w:color="E6E1D8"/>
+              <w:bottom w:val="single" w:sz="2" w:space="0" w:color="E6E1D8"/>
+              <w:right w:val="single" w:sz="2" w:space="0" w:color="E6E1D8"/>
+            </w:tcBorders>
+            <w:tcMar>
+              <w:top w:w="70" w:type="dxa"/>
+              <w:left w:w="120" w:type="dxa"/>
+              <w:bottom w:w="70" w:type="dxa"/>
+              <w:right w:w="120" w:type="dxa"/>
+            </w:tcMar>
+            <w:vAlign w:val="center"/>
+          </w:tcPr>
+          <w:p>
+            <w:r>
+              <w:t>Pre-work ask, attendee preview</w:t>
+            </w:r>
+          </w:p>
+        </w:tc>
+      </w:tr>
+      <w:tr>
+        <w:tc>
+          <w:tcPr>
+            <w:tcW w:w="3600" w:type="dxa"/>
+            <w:tcBorders>
+              <w:top w:val="single" w:sz="2" w:space="0" w:color="E6E1D8"/>
+              <w:left w:val="single" w:sz="2" w:space="0" w:color="E6E1D8"/>
+              <w:bottom w:val="single" w:sz="2" w:space="0" w:color="E6E1D8"/>
+              <w:right w:val="single" w:sz="2" w:space="0" w:color="E6E1D8"/>
+            </w:tcBorders>
+            <w:tcMar>
+              <w:top w:w="70" w:type="dxa"/>
+              <w:left w:w="120" w:type="dxa"/>
+              <w:bottom w:w="70" w:type="dxa"/>
+              <w:right w:w="120" w:type="dxa"/>
+            </w:tcMar>
+            <w:vAlign w:val="center"/>
+          </w:tcPr>
+          <w:p>
+            <w:r>
+              <w:t>Personal outreach</w:t>
+            </w:r>
+          </w:p>
+        </w:tc>
+        <w:tc>
+          <w:tcPr>
+            <w:tcW w:w="1200" w:type="dxa"/>
+            <w:tcBorders>
+              <w:top w:val="single" w:sz="2" w:space="0" w:color="E6E1D8"/>
+              <w:left w:val="single" w:sz="2" w:space="0" w:color="E6E1D8"/>
+              <w:bottom w:val="single" w:sz="2" w:space="0" w:color="E6E1D8"/>
+              <w:right w:val="single" w:sz="2" w:space="0" w:color="E6E1D8"/>
+            </w:tcBorders>
+            <w:tcMar>
+              <w:top w:w="70" w:type="dxa"/>
+              <w:left w:w="120" w:type="dxa"/>
+              <w:bottom w:w="70" w:type="dxa"/>
+              <w:right w:w="120" w:type="dxa"/>
+            </w:tcMar>
+            <w:vAlign w:val="center"/>
+          </w:tcPr>
+          <w:p>
+            <w:r>
+              <w:t>1–2 days out</w:t>
+            </w:r>
+          </w:p>
+        </w:tc>
+        <w:tc>
+          <w:tcPr>
+            <w:tcW w:w="4560" w:type="dxa"/>
+            <w:tcBorders>
+              <w:top w:val="single" w:sz="2" w:space="0" w:color="E6E1D8"/>
+              <w:left w:val="single" w:sz="2" w:space="0" w:color="E6E1D8"/>
+              <w:bottom w:val="single" w:sz="2" w:space="0" w:color="E6E1D8"/>
+              <w:right w:val="single" w:sz="2" w:space="0" w:color="E6E1D8"/>
+            </w:tcBorders>
+            <w:tcMar>
+              <w:top w:w="70" w:type="dxa"/>
+              <w:left w:w="120" w:type="dxa"/>
+              <w:bottom w:w="70" w:type="dxa"/>
+              <w:right w:w="120" w:type="dxa"/>
+            </w:tcMar>
+            <w:vAlign w:val="center"/>
+          </w:tcPr>
+          <w:p>
+            <w:r>
+              <w:t>Text/LinkedIn to top registrants</w:t>
+            </w:r>
+          </w:p>
+        </w:tc>
+      </w:tr>
+      <w:tr>
+        <w:tc>
+          <w:tcPr>
+            <w:tcW w:w="3600" w:type="dxa"/>
+            <w:tcBorders>
+              <w:top w:val="single" w:sz="2" w:space="0" w:color="E6E1D8"/>
+              <w:left w:val="single" w:sz="2" w:space="0" w:color="E6E1D8"/>
+              <w:bottom w:val="single" w:sz="2" w:space="0" w:color="E6E1D8"/>
+              <w:right w:val="single" w:sz="2" w:space="0" w:color="E6E1D8"/>
+            </w:tcBorders>
+            <w:tcMar>
+              <w:top w:w="70" w:type="dxa"/>
+              <w:left w:w="120" w:type="dxa"/>
+              <w:bottom w:w="70" w:type="dxa"/>
+              <w:right w:w="120" w:type="dxa"/>
+            </w:tcMar>
+            <w:vAlign w:val="center"/>
+          </w:tcPr>
+          <w:p>
+            <w:r>
+              <w:t>Day-of email</w:t>
+            </w:r>
+          </w:p>
+        </w:tc>
+        <w:tc>
+          <w:tcPr>
+            <w:tcW w:w="1200" w:type="dxa"/>
+            <w:tcBorders>
+              <w:top w:val="single" w:sz="2" w:space="0" w:color="E6E1D8"/>
+              <w:left w:val="single" w:sz="2" w:space="0" w:color="E6E1D8"/>
+              <w:bottom w:val="single" w:sz="2" w:space="0" w:color="E6E1D8"/>
+              <w:right w:val="single" w:sz="2" w:space="0" w:color="E6E1D8"/>
+            </w:tcBorders>
+            <w:tcMar>
+              <w:top w:w="70" w:type="dxa"/>
+              <w:left w:w="120" w:type="dxa"/>
+              <w:bottom w:w="70" w:type="dxa"/>
+              <w:right w:w="120" w:type="dxa"/>
+            </w:tcMar>
+            <w:vAlign w:val="center"/>
+          </w:tcPr>
+          <w:p>
+            <w:r>
+              <w:t>Morning of</w:t>
+            </w:r>
+          </w:p>
+        </w:tc>
+        <w:tc>
+          <w:tcPr>
+            <w:tcW w:w="4560" w:type="dxa"/>
+            <w:tcBorders>
+              <w:top w:val="single" w:sz="2" w:space="0" w:color="E6E1D8"/>
+              <w:left w:val="single" w:sz="2" w:space="0" w:color="E6E1D8"/>
+              <w:bottom w:val="single" w:sz="2" w:space="0" w:color="E6E1D8"/>
+              <w:right w:val="single" w:sz="2" w:space="0" w:color="E6E1D8"/>
+            </w:tcBorders>
+            <w:tcMar>
+              <w:top w:w="70" w:type="dxa"/>
+              <w:left w:w="120" w:type="dxa"/>
+              <w:bottom w:w="70" w:type="dxa"/>
+              <w:right w:w="120" w:type="dxa"/>
+            </w:tcMar>
+            <w:vAlign w:val="center"/>
+          </w:tcPr>
+          <w:p>
+            <w:r>
+              <w:t>Template below</w:t>
+            </w:r>
+          </w:p>
+        </w:tc>
+      </w:tr>
+      <w:tr>
+        <w:tc>
+          <w:tcPr>
+            <w:tcW w:w="3600" w:type="dxa"/>
+            <w:tcBorders>
+              <w:top w:val="single" w:sz="2" w:space="0" w:color="E6E1D8"/>
+              <w:left w:val="single" w:sz="2" w:space="0" w:color="E6E1D8"/>
+              <w:bottom w:val="single" w:sz="2" w:space="0" w:color="E6E1D8"/>
+              <w:right w:val="single" w:sz="2" w:space="0" w:color="E6E1D8"/>
+            </w:tcBorders>
+            <w:tcMar>
+              <w:top w:w="70" w:type="dxa"/>
+              <w:left w:w="120" w:type="dxa"/>
+              <w:bottom w:w="70" w:type="dxa"/>
+              <w:right w:w="120" w:type="dxa"/>
+            </w:tcMar>
+            <w:vAlign w:val="center"/>
+          </w:tcPr>
+          <w:p>
+            <w:r>
+              <w:t>Follow-up</w:t>
+            </w:r>
+          </w:p>
+        </w:tc>
+        <w:tc>
+          <w:tcPr>
+            <w:tcW w:w="1200" w:type="dxa"/>
+            <w:tcBorders>
+              <w:top w:val="single" w:sz="2" w:space="0" w:color="E6E1D8"/>
+              <w:left w:val="single" w:sz="2" w:space="0" w:color="E6E1D8"/>
+              <w:bottom w:val="single" w:sz="2" w:space="0" w:color="E6E1D8"/>
+              <w:right w:val="single" w:sz="2" w:space="0" w:color="E6E1D8"/>
+            </w:tcBorders>
+            <w:tcMar>
+              <w:top w:w="70" w:type="dxa"/>
+              <w:left w:w="120" w:type="dxa"/>
+              <w:bottom w:w="70" w:type="dxa"/>
+              <w:right w:w="120" w:type="dxa"/>
+            </w:tcMar>
+            <w:vAlign w:val="center"/>
+          </w:tcPr>
+          <w:p>
+            <w:r>
+              <w:t>Next day</w:t>
+            </w:r>
+          </w:p>
+        </w:tc>
+        <w:tc>
+          <w:tcPr>
+            <w:tcW w:w="4560" w:type="dxa"/>
+            <w:tcBorders>
+              <w:top w:val="single" w:sz="2" w:space="0" w:color="E6E1D8"/>
+              <w:left w:val="single" w:sz="2" w:space="0" w:color="E6E1D8"/>
+              <w:bottom w:val="single" w:sz="2" w:space="0" w:color="E6E1D8"/>
+              <w:right w:val="single" w:sz="2" w:space="0" w:color="E6E1D8"/>
+            </w:tcBorders>
+            <w:tcMar>
+              <w:top w:w="70" w:type="dxa"/>
+              <w:left w:w="120" w:type="dxa"/>
+              <w:bottom w:w="70" w:type="dxa"/>
+              <w:right w:w="120" w:type="dxa"/>
+            </w:tcMar>
+            <w:vAlign w:val="center"/>
+          </w:tcPr>
+          <w:p>
+            <w:r>
+              <w:t>Recap for attendees; teaser for no-shows</w:t>
+            </w:r>
+          </w:p>
+        </w:tc>
+      </w:tr>
+    </w:tbl>
+    <w:p>
+      <w:pPr>
+        <w:spacing w:after="60"/>
+      </w:pPr>
+      <w:r>
+        <w:rPr>
+          <w:b/>
+          <w:bCs/>
+          <w:color w:val="0792B5"/>
+        </w:rPr>
+        <w:t>Day-of reminder email template</w:t>
+      </w:r>
+    </w:p>
+    <w:tbl>
+      <w:tblPr>
+        <w:tblW w:w="9360" w:type="dxa"/>
+        <w:tblBorders>
+          <w:left w:val="single" w:sz="18" w:space="0" w:color="CC785C"/>
+          <w:insideH w:val="single" w:sz="4" w:space="0" w:color="auto"/>
+          <w:insideV w:val="single" w:sz="4" w:space="0" w:color="auto"/>
+        </w:tblBorders>
+        <w:tblCellMar>
+          <w:left w:w="10" w:type="dxa"/>
+          <w:right w:w="10" w:type="dxa"/>
+        </w:tblCellMar>
+        <w:tblLook w:val="04A0" w:firstRow="1" w:lastRow="0" w:firstColumn="1" w:lastColumn="0" w:noHBand="0" w:noVBand="1"/>
+      </w:tblPr>
+      <w:tblGrid>
+        <w:gridCol w:w="9360"/>
+      </w:tblGrid>
+      <w:tr>
+        <w:tc>
+          <w:tcPr>
+            <w:tcW w:w="9360" w:type="dxa"/>
+            <w:tcBorders>
+              <w:left w:val="single" w:sz="18" w:space="0" w:color="CC785C"/>
+            </w:tcBorders>
+            <w:shd w:val="clear" w:color="auto" w:fill="F7F4EE"/>
+            <w:tcMar>
+              <w:top w:w="120" w:type="dxa"/>
+              <w:left w:w="200" w:type="dxa"/>
+              <w:bottom w:w="120" w:type="dxa"/>
+              <w:right w:w="200" w:type="dxa"/>
+            </w:tcMar>
+          </w:tcPr>
+          <w:p>
+            <w:pPr>
+              <w:spacing w:after="100"/>
+            </w:pPr>
+            <w:r>
+              <w:rPr>
+                <w:b/>
+                <w:bCs/>
+                <w:color w:val="0D274D"/>
+              </w:rPr>
+              <w:t xml:space="preserve">Subject: Today: bring a laptop and a real problem</w:t>
+            </w:r>
+          </w:p>
+          <w:p>
+            <w:pPr>
+              <w:spacing w:after="100"/>
+            </w:pPr>
+            <w:r>
+              <w:rPr>
+                <w:b/>
+                <w:bCs/>
+                <w:color w:val="0D274D"/>
+              </w:rPr>
+              <w:t xml:space="preserve"/>
+            </w:r>
+          </w:p>
+          <w:p>
+            <w:pPr>
+              <w:spacing w:after="100"/>
+            </w:pPr>
+            <w:r>
+              <w:rPr>
+                <w:b/>
+                <w:bCs/>
+                <w:color w:val="0D274D"/>
+              </w:rPr>
+              <w:t xml:space="preserve">Hi [First Name],</w:t>
+            </w:r>
+          </w:p>
+          <w:p>
+            <w:pPr>
+              <w:spacing w:after="100"/>
+            </w:pPr>
+            <w:r>
+              <w:rPr>
+                <w:b/>
+                <w:bCs/>
+                <w:color w:val="0D274D"/>
+              </w:rPr>
+              <w:t xml:space="preserve"/>
+            </w:r>
+          </w:p>
+          <w:p>
+            <w:pPr>
+              <w:spacing w:after="100"/>
+            </w:pPr>
+            <w:r>
+              <w:rPr>
+                <w:b/>
+                <w:bCs/>
+                <w:color w:val="0D274D"/>
+              </w:rPr>
+              <w:t xml:space="preserve">Today's the day, and I'm really looking forward to seeing you at AI Assurance — Partner MCP Day at [Venue].</w:t>
+            </w:r>
+          </w:p>
+          <w:p>
+            <w:pPr>
+              <w:spacing w:after="100"/>
+            </w:pPr>
+            <w:r>
+              <w:rPr>
+                <w:b/>
+                <w:bCs/>
+                <w:color w:val="0D274D"/>
+              </w:rPr>
+              <w:t xml:space="preserve"/>
+            </w:r>
+          </w:p>
+          <w:p>
+            <w:pPr>
+              <w:spacing w:after="100"/>
+            </w:pPr>
+            <w:r>
+              <w:rPr>
+                <w:b/>
+                <w:bCs/>
+                <w:color w:val="0D274D"/>
+              </w:rPr>
+              <w:t xml:space="preserve">Here's why I'd encourage you to be in the room rather than catching up afterward:</w:t>
+            </w:r>
+          </w:p>
+          <w:p>
+            <w:pPr>
+              <w:spacing w:after="100"/>
+            </w:pPr>
+            <w:r>
+              <w:rPr>
+                <w:b/>
+                <w:bCs/>
+                <w:color w:val="0D274D"/>
+              </w:rPr>
+              <w:t xml:space="preserve">• You'll build something, not just watch. The hands-on labs are the heart of the day — you'll work through the ThousandEyes and Meraki labs (plus Splunk and MCP tool-building, if running) with guidance from our SEs, and leave with a workflow you can use with your own customers next week.</w:t>
+            </w:r>
+          </w:p>
+          <w:p>
+            <w:pPr>
+              <w:spacing w:after="100"/>
+            </w:pPr>
+            <w:r>
+              <w:rPr>
+                <w:b/>
+                <w:bCs/>
+                <w:color w:val="0D274D"/>
+              </w:rPr>
+              <w:t xml:space="preserve">• The conversations are the real value. You'll be sitting with partner peers working through the same questions you are: how to bring AI into network operations, what's working, and what isn't. Past attendees say these conversations were the most useful part of the day.</w:t>
+            </w:r>
+          </w:p>
+          <w:p>
+            <w:pPr>
+              <w:spacing w:after="100"/>
+            </w:pPr>
+            <w:r>
+              <w:rPr>
+                <w:b/>
+                <w:bCs/>
+                <w:color w:val="0D274D"/>
+              </w:rPr>
+              <w:t xml:space="preserve">• Bring a laptop and a real problem. The more specific your challenge, the more you'll get out of both the workshop and the room.</w:t>
+            </w:r>
+          </w:p>
+          <w:p>
+            <w:pPr>
+              <w:spacing w:after="100"/>
+            </w:pPr>
+            <w:r>
+              <w:rPr>
+                <w:b/>
+                <w:bCs/>
+                <w:color w:val="0D274D"/>
+              </w:rPr>
+              <w:t xml:space="preserve"/>
+            </w:r>
+          </w:p>
+          <w:p>
+            <w:pPr>
+              <w:spacing w:after="100"/>
+            </w:pPr>
+            <w:r>
+              <w:rPr>
+                <w:b/>
+                <w:bCs/>
+                <w:color w:val="0D274D"/>
+              </w:rPr>
+              <w:t xml:space="preserve">The details</w:t>
+            </w:r>
+          </w:p>
+          <w:p>
+            <w:pPr>
+              <w:spacing w:after="100"/>
+            </w:pPr>
+            <w:r>
+              <w:rPr>
+                <w:b/>
+                <w:bCs/>
+                <w:color w:val="0D274D"/>
+              </w:rPr>
+              <w:t xml:space="preserve">• Where: [Venue + address]</w:t>
+            </w:r>
+          </w:p>
+          <w:p>
+            <w:pPr>
+              <w:spacing w:after="100"/>
+            </w:pPr>
+            <w:r>
+              <w:rPr>
+                <w:b/>
+                <w:bCs/>
+                <w:color w:val="0D274D"/>
+              </w:rPr>
+              <w:t xml:space="preserve">• When: Doors 8:30 | Workshop kicks off 9:00</w:t>
+            </w:r>
+          </w:p>
+          <w:p>
+            <w:pPr>
+              <w:spacing w:after="100"/>
+            </w:pPr>
+            <w:r>
+              <w:rPr>
+                <w:b/>
+                <w:bCs/>
+                <w:color w:val="0D274D"/>
+              </w:rPr>
+              <w:t xml:space="preserve">• Bring: Laptop with admin rights, charger, [login/prereq from the Section 4 email]</w:t>
+            </w:r>
+          </w:p>
+          <w:p>
+            <w:pPr>
+              <w:spacing w:after="100"/>
+            </w:pPr>
+            <w:r>
+              <w:rPr>
+                <w:b/>
+                <w:bCs/>
+                <w:color w:val="0D274D"/>
+              </w:rPr>
+              <w:t xml:space="preserve">• Parking/check-in: [tip]</w:t>
+            </w:r>
+          </w:p>
+          <w:p>
+            <w:pPr>
+              <w:spacing w:after="100"/>
+            </w:pPr>
+            <w:r>
+              <w:rPr>
+                <w:b/>
+                <w:bCs/>
+                <w:color w:val="0D274D"/>
+              </w:rPr>
+              <w:t xml:space="preserve"/>
+            </w:r>
+          </w:p>
+          <w:p>
+            <w:pPr>
+              <w:spacing w:after="100"/>
+            </w:pPr>
+            <w:r>
+              <w:rPr>
+                <w:b/>
+                <w:bCs/>
+                <w:color w:val="0D274D"/>
+              </w:rPr>
+              <w:t xml:space="preserve">If something has come up, just reply and let me know. But if there's any way to make it, I'd love to see you there. Find me at [registration table] and I'll personally introduce you to a few people worth knowing.</w:t>
+            </w:r>
+          </w:p>
+          <w:p>
+            <w:pPr>
+              <w:spacing w:after="100"/>
+            </w:pPr>
+            <w:r>
+              <w:rPr>
+                <w:b/>
+                <w:bCs/>
+                <w:color w:val="0D274D"/>
+              </w:rPr>
+              <w:t xml:space="preserve"/>
+            </w:r>
+          </w:p>
+          <w:p>
+            <w:pPr>
+              <w:spacing w:after="100"/>
+            </w:pPr>
+            <w:r>
+              <w:rPr>
+                <w:b/>
+                <w:bCs/>
+                <w:color w:val="0D274D"/>
+              </w:rPr>
+              <w:t xml:space="preserve">See you this morning,</w:t>
+            </w:r>
+          </w:p>
+          <w:p>
+            <w:pPr>
+              <w:spacing w:after="100"/>
+            </w:pPr>
+            <w:r>
+              <w:rPr>
+                <w:b/>
+                <w:bCs/>
+                <w:color w:val="0D274D"/>
+              </w:rPr>
+              <w:t xml:space="preserve">[Host name]</w:t>
+            </w:r>
+          </w:p>
+        </w:tc>
+      </w:tr>
+    </w:tbl>
     <w:tbl>
       <w:tblPr>
         <w:tblW w:w="9360" w:type="dxa"/>

</xml_diff>